<commit_message>
feat: add alih-status feature with data management, document templates, and import component
</commit_message>
<xml_diff>
--- a/public/template/alih-status/spkmb.docx
+++ b/public/template/alih-status/spkmb.docx
@@ -1272,7 +1272,7 @@
     </w:p>
     <w:tbl>
       <w:tblPr>
-        <w:tblW w:w="16441" w:type="dxa"/>
+        <w:tblW w:w="16439" w:type="dxa"/>
         <w:jc w:val="center"/>
         <w:tblBorders>
           <w:top w:val="single" w:sz="2" w:space="0" w:color="auto"/>
@@ -1295,8 +1295,8 @@
         <w:gridCol w:w="282"/>
         <w:gridCol w:w="680"/>
         <w:gridCol w:w="567"/>
-        <w:gridCol w:w="1134"/>
-        <w:gridCol w:w="1134"/>
+        <w:gridCol w:w="850"/>
+        <w:gridCol w:w="850"/>
         <w:gridCol w:w="737"/>
         <w:gridCol w:w="737"/>
         <w:gridCol w:w="737"/>
@@ -1311,7 +1311,8 @@
         <w:gridCol w:w="1134"/>
         <w:gridCol w:w="1134"/>
         <w:gridCol w:w="1134"/>
-        <w:gridCol w:w="1134"/>
+        <w:gridCol w:w="850"/>
+        <w:gridCol w:w="850"/>
       </w:tblGrid>
       <w:tr>
         <w:trPr>
@@ -1320,7 +1321,7 @@
         </w:trPr>
         <w:tc>
           <w:tcPr>
-            <w:tcW w:w="283" w:type="dxa"/>
+            <w:tcW w:w="282" w:type="dxa"/>
             <w:tcMar>
               <w:top w:w="100" w:type="dxa"/>
               <w:left w:w="100" w:type="dxa"/>
@@ -1336,16 +1337,16 @@
               <w:rPr>
                 <w:b/>
                 <w:bCs/>
-                <w:sz w:val="12"/>
-                <w:szCs w:val="12"/>
-              </w:rPr>
-            </w:pPr>
-            <w:r>
-              <w:rPr>
-                <w:b/>
-                <w:bCs/>
-                <w:sz w:val="12"/>
-                <w:szCs w:val="12"/>
+                <w:sz w:val="10"/>
+                <w:szCs w:val="10"/>
+              </w:rPr>
+            </w:pPr>
+            <w:r>
+              <w:rPr>
+                <w:b/>
+                <w:bCs/>
+                <w:sz w:val="10"/>
+                <w:szCs w:val="10"/>
               </w:rPr>
               <w:t>NO.</w:t>
             </w:r>
@@ -1363,16 +1364,16 @@
               <w:rPr>
                 <w:b/>
                 <w:bCs/>
-                <w:sz w:val="12"/>
-                <w:szCs w:val="12"/>
-              </w:rPr>
-            </w:pPr>
-            <w:r>
-              <w:rPr>
-                <w:b/>
-                <w:bCs/>
-                <w:sz w:val="12"/>
-                <w:szCs w:val="12"/>
+                <w:sz w:val="10"/>
+                <w:szCs w:val="10"/>
+              </w:rPr>
+            </w:pPr>
+            <w:r>
+              <w:rPr>
+                <w:b/>
+                <w:bCs/>
+                <w:sz w:val="10"/>
+                <w:szCs w:val="10"/>
               </w:rPr>
               <w:t>JENIS BARANG</w:t>
             </w:r>
@@ -1396,16 +1397,16 @@
               <w:rPr>
                 <w:b/>
                 <w:bCs/>
-                <w:sz w:val="12"/>
-                <w:szCs w:val="12"/>
-              </w:rPr>
-            </w:pPr>
-            <w:r>
-              <w:rPr>
-                <w:b/>
-                <w:bCs/>
-                <w:sz w:val="12"/>
-                <w:szCs w:val="12"/>
+                <w:sz w:val="10"/>
+                <w:szCs w:val="10"/>
+              </w:rPr>
+            </w:pPr>
+            <w:r>
+              <w:rPr>
+                <w:b/>
+                <w:bCs/>
+                <w:sz w:val="10"/>
+                <w:szCs w:val="10"/>
               </w:rPr>
               <w:t>KODE BARANG</w:t>
             </w:r>
@@ -1413,7 +1414,7 @@
         </w:tc>
         <w:tc>
           <w:tcPr>
-            <w:tcW w:w="1134" w:type="dxa"/>
+            <w:tcW w:w="850" w:type="dxa"/>
             <w:tcMar>
               <w:top w:w="100" w:type="dxa"/>
               <w:left w:w="100" w:type="dxa"/>
@@ -1429,16 +1430,16 @@
               <w:rPr>
                 <w:b/>
                 <w:bCs/>
-                <w:sz w:val="12"/>
-                <w:szCs w:val="12"/>
-              </w:rPr>
-            </w:pPr>
-            <w:r>
-              <w:rPr>
-                <w:b/>
-                <w:bCs/>
-                <w:sz w:val="12"/>
-                <w:szCs w:val="12"/>
+                <w:sz w:val="10"/>
+                <w:szCs w:val="10"/>
+              </w:rPr>
+            </w:pPr>
+            <w:r>
+              <w:rPr>
+                <w:b/>
+                <w:bCs/>
+                <w:sz w:val="10"/>
+                <w:szCs w:val="10"/>
               </w:rPr>
               <w:t>NIBAR</w:t>
             </w:r>
@@ -1446,7 +1447,7 @@
         </w:tc>
         <w:tc>
           <w:tcPr>
-            <w:tcW w:w="1134" w:type="dxa"/>
+            <w:tcW w:w="850" w:type="dxa"/>
             <w:tcMar>
               <w:top w:w="100" w:type="dxa"/>
               <w:left w:w="100" w:type="dxa"/>
@@ -1462,16 +1463,16 @@
               <w:rPr>
                 <w:b/>
                 <w:bCs/>
-                <w:sz w:val="12"/>
-                <w:szCs w:val="12"/>
-              </w:rPr>
-            </w:pPr>
-            <w:r>
-              <w:rPr>
-                <w:b/>
-                <w:bCs/>
-                <w:sz w:val="12"/>
-                <w:szCs w:val="12"/>
+                <w:sz w:val="10"/>
+                <w:szCs w:val="10"/>
+              </w:rPr>
+            </w:pPr>
+            <w:r>
+              <w:rPr>
+                <w:b/>
+                <w:bCs/>
+                <w:sz w:val="10"/>
+                <w:szCs w:val="10"/>
               </w:rPr>
               <w:t>KODE REGISTER</w:t>
             </w:r>
@@ -1495,16 +1496,16 @@
               <w:rPr>
                 <w:b/>
                 <w:bCs/>
-                <w:sz w:val="12"/>
-                <w:szCs w:val="12"/>
-              </w:rPr>
-            </w:pPr>
-            <w:r>
-              <w:rPr>
-                <w:b/>
-                <w:bCs/>
-                <w:sz w:val="12"/>
-                <w:szCs w:val="12"/>
+                <w:sz w:val="10"/>
+                <w:szCs w:val="10"/>
+              </w:rPr>
+            </w:pPr>
+            <w:r>
+              <w:rPr>
+                <w:b/>
+                <w:bCs/>
+                <w:sz w:val="10"/>
+                <w:szCs w:val="10"/>
               </w:rPr>
               <w:t>NAMA BARANG / KATE</w:t>
             </w:r>
@@ -1512,18 +1513,10 @@
               <w:rPr>
                 <w:b/>
                 <w:bCs/>
-                <w:sz w:val="12"/>
-                <w:szCs w:val="12"/>
+                <w:sz w:val="10"/>
+                <w:szCs w:val="10"/>
               </w:rPr>
               <w:br/>
-            </w:r>
-            <w:r>
-              <w:rPr>
-                <w:b/>
-                <w:bCs/>
-                <w:sz w:val="12"/>
-                <w:szCs w:val="12"/>
-              </w:rPr>
               <w:t>GORI</w:t>
             </w:r>
           </w:p>
@@ -1546,16 +1539,16 @@
               <w:rPr>
                 <w:b/>
                 <w:bCs/>
-                <w:sz w:val="12"/>
-                <w:szCs w:val="12"/>
-              </w:rPr>
-            </w:pPr>
-            <w:r>
-              <w:rPr>
-                <w:b/>
-                <w:bCs/>
-                <w:sz w:val="12"/>
-                <w:szCs w:val="12"/>
+                <w:sz w:val="10"/>
+                <w:szCs w:val="10"/>
+              </w:rPr>
+            </w:pPr>
+            <w:r>
+              <w:rPr>
+                <w:b/>
+                <w:bCs/>
+                <w:sz w:val="10"/>
+                <w:szCs w:val="10"/>
               </w:rPr>
               <w:t>MERK / TYPE</w:t>
             </w:r>
@@ -1579,16 +1572,16 @@
               <w:rPr>
                 <w:b/>
                 <w:bCs/>
-                <w:sz w:val="12"/>
-                <w:szCs w:val="12"/>
-              </w:rPr>
-            </w:pPr>
-            <w:r>
-              <w:rPr>
-                <w:b/>
-                <w:bCs/>
-                <w:sz w:val="12"/>
-                <w:szCs w:val="12"/>
+                <w:sz w:val="10"/>
+                <w:szCs w:val="10"/>
+              </w:rPr>
+            </w:pPr>
+            <w:r>
+              <w:rPr>
+                <w:b/>
+                <w:bCs/>
+                <w:sz w:val="10"/>
+                <w:szCs w:val="10"/>
               </w:rPr>
               <w:t>NOMOR POLISI</w:t>
             </w:r>
@@ -1612,16 +1605,16 @@
               <w:rPr>
                 <w:b/>
                 <w:bCs/>
-                <w:sz w:val="12"/>
-                <w:szCs w:val="12"/>
-              </w:rPr>
-            </w:pPr>
-            <w:r>
-              <w:rPr>
-                <w:b/>
-                <w:bCs/>
-                <w:sz w:val="12"/>
-                <w:szCs w:val="12"/>
+                <w:sz w:val="10"/>
+                <w:szCs w:val="10"/>
+              </w:rPr>
+            </w:pPr>
+            <w:r>
+              <w:rPr>
+                <w:b/>
+                <w:bCs/>
+                <w:sz w:val="10"/>
+                <w:szCs w:val="10"/>
               </w:rPr>
               <w:t>NOMOR RANGKA</w:t>
             </w:r>
@@ -1645,16 +1638,16 @@
               <w:rPr>
                 <w:b/>
                 <w:bCs/>
-                <w:sz w:val="12"/>
-                <w:szCs w:val="12"/>
-              </w:rPr>
-            </w:pPr>
-            <w:r>
-              <w:rPr>
-                <w:b/>
-                <w:bCs/>
-                <w:sz w:val="12"/>
-                <w:szCs w:val="12"/>
+                <w:sz w:val="10"/>
+                <w:szCs w:val="10"/>
+              </w:rPr>
+            </w:pPr>
+            <w:r>
+              <w:rPr>
+                <w:b/>
+                <w:bCs/>
+                <w:sz w:val="10"/>
+                <w:szCs w:val="10"/>
               </w:rPr>
               <w:t>NOMOR MESIN</w:t>
             </w:r>
@@ -1678,16 +1671,16 @@
               <w:rPr>
                 <w:b/>
                 <w:bCs/>
-                <w:sz w:val="12"/>
-                <w:szCs w:val="12"/>
-              </w:rPr>
-            </w:pPr>
-            <w:r>
-              <w:rPr>
-                <w:b/>
-                <w:bCs/>
-                <w:sz w:val="12"/>
-                <w:szCs w:val="12"/>
+                <w:sz w:val="10"/>
+                <w:szCs w:val="10"/>
+              </w:rPr>
+            </w:pPr>
+            <w:r>
+              <w:rPr>
+                <w:b/>
+                <w:bCs/>
+                <w:sz w:val="10"/>
+                <w:szCs w:val="10"/>
               </w:rPr>
               <w:t>KONDISI</w:t>
             </w:r>
@@ -1711,16 +1704,16 @@
               <w:rPr>
                 <w:b/>
                 <w:bCs/>
-                <w:sz w:val="12"/>
-                <w:szCs w:val="12"/>
-              </w:rPr>
-            </w:pPr>
-            <w:r>
-              <w:rPr>
-                <w:b/>
-                <w:bCs/>
-                <w:sz w:val="12"/>
-                <w:szCs w:val="12"/>
+                <w:sz w:val="10"/>
+                <w:szCs w:val="10"/>
+              </w:rPr>
+            </w:pPr>
+            <w:r>
+              <w:rPr>
+                <w:b/>
+                <w:bCs/>
+                <w:sz w:val="10"/>
+                <w:szCs w:val="10"/>
               </w:rPr>
               <w:t>LOKASI</w:t>
             </w:r>
@@ -1744,16 +1737,16 @@
               <w:rPr>
                 <w:b/>
                 <w:bCs/>
-                <w:sz w:val="12"/>
-                <w:szCs w:val="12"/>
-              </w:rPr>
-            </w:pPr>
-            <w:r>
-              <w:rPr>
-                <w:b/>
-                <w:bCs/>
-                <w:sz w:val="12"/>
-                <w:szCs w:val="12"/>
+                <w:sz w:val="10"/>
+                <w:szCs w:val="10"/>
+              </w:rPr>
+            </w:pPr>
+            <w:r>
+              <w:rPr>
+                <w:b/>
+                <w:bCs/>
+                <w:sz w:val="10"/>
+                <w:szCs w:val="10"/>
               </w:rPr>
               <w:t>ASAL-USUL</w:t>
             </w:r>
@@ -1771,16 +1764,16 @@
               <w:rPr>
                 <w:b/>
                 <w:bCs/>
-                <w:sz w:val="12"/>
-                <w:szCs w:val="12"/>
-              </w:rPr>
-            </w:pPr>
-            <w:r>
-              <w:rPr>
-                <w:b/>
-                <w:bCs/>
-                <w:sz w:val="12"/>
-                <w:szCs w:val="12"/>
+                <w:sz w:val="10"/>
+                <w:szCs w:val="10"/>
+              </w:rPr>
+            </w:pPr>
+            <w:r>
+              <w:rPr>
+                <w:b/>
+                <w:bCs/>
+                <w:sz w:val="10"/>
+                <w:szCs w:val="10"/>
               </w:rPr>
               <w:t>TAHUN</w:t>
             </w:r>
@@ -1788,7 +1781,7 @@
         </w:tc>
         <w:tc>
           <w:tcPr>
-            <w:tcW w:w="567" w:type="dxa"/>
+            <w:tcW w:w="568" w:type="dxa"/>
             <w:vAlign w:val="center"/>
           </w:tcPr>
           <w:p>
@@ -1798,16 +1791,16 @@
               <w:rPr>
                 <w:b/>
                 <w:bCs/>
-                <w:sz w:val="12"/>
-                <w:szCs w:val="12"/>
-              </w:rPr>
-            </w:pPr>
-            <w:r>
-              <w:rPr>
-                <w:b/>
-                <w:bCs/>
-                <w:sz w:val="12"/>
-                <w:szCs w:val="12"/>
+                <w:sz w:val="10"/>
+                <w:szCs w:val="10"/>
+              </w:rPr>
+            </w:pPr>
+            <w:r>
+              <w:rPr>
+                <w:b/>
+                <w:bCs/>
+                <w:sz w:val="10"/>
+                <w:szCs w:val="10"/>
               </w:rPr>
               <w:t>JUM</w:t>
             </w:r>
@@ -1815,18 +1808,10 @@
               <w:rPr>
                 <w:b/>
                 <w:bCs/>
-                <w:sz w:val="12"/>
-                <w:szCs w:val="12"/>
+                <w:sz w:val="10"/>
+                <w:szCs w:val="10"/>
               </w:rPr>
               <w:br/>
-            </w:r>
-            <w:r>
-              <w:rPr>
-                <w:b/>
-                <w:bCs/>
-                <w:sz w:val="12"/>
-                <w:szCs w:val="12"/>
-              </w:rPr>
               <w:t>LAH</w:t>
             </w:r>
           </w:p>
@@ -1843,16 +1828,16 @@
               <w:rPr>
                 <w:b/>
                 <w:bCs/>
-                <w:sz w:val="12"/>
-                <w:szCs w:val="12"/>
-              </w:rPr>
-            </w:pPr>
-            <w:r>
-              <w:rPr>
-                <w:b/>
-                <w:bCs/>
-                <w:sz w:val="12"/>
-                <w:szCs w:val="12"/>
+                <w:sz w:val="10"/>
+                <w:szCs w:val="10"/>
+              </w:rPr>
+            </w:pPr>
+            <w:r>
+              <w:rPr>
+                <w:b/>
+                <w:bCs/>
+                <w:sz w:val="10"/>
+                <w:szCs w:val="10"/>
               </w:rPr>
               <w:t>NILAI PEROLEHAN</w:t>
             </w:r>
@@ -1870,16 +1855,16 @@
               <w:rPr>
                 <w:b/>
                 <w:bCs/>
-                <w:sz w:val="12"/>
-                <w:szCs w:val="12"/>
-              </w:rPr>
-            </w:pPr>
-            <w:r>
-              <w:rPr>
-                <w:b/>
-                <w:bCs/>
-                <w:sz w:val="12"/>
-                <w:szCs w:val="12"/>
+                <w:sz w:val="10"/>
+                <w:szCs w:val="10"/>
+              </w:rPr>
+            </w:pPr>
+            <w:r>
+              <w:rPr>
+                <w:b/>
+                <w:bCs/>
+                <w:sz w:val="10"/>
+                <w:szCs w:val="10"/>
               </w:rPr>
               <w:t>AKUMULASI PENYUSUTAN</w:t>
             </w:r>
@@ -1897,16 +1882,16 @@
               <w:rPr>
                 <w:b/>
                 <w:bCs/>
-                <w:sz w:val="12"/>
-                <w:szCs w:val="12"/>
-              </w:rPr>
-            </w:pPr>
-            <w:r>
-              <w:rPr>
-                <w:b/>
-                <w:bCs/>
-                <w:sz w:val="12"/>
-                <w:szCs w:val="12"/>
+                <w:sz w:val="10"/>
+                <w:szCs w:val="10"/>
+              </w:rPr>
+            </w:pPr>
+            <w:r>
+              <w:rPr>
+                <w:b/>
+                <w:bCs/>
+                <w:sz w:val="10"/>
+                <w:szCs w:val="10"/>
               </w:rPr>
               <w:t>NILAI BUKU</w:t>
             </w:r>
@@ -1924,16 +1909,43 @@
               <w:rPr>
                 <w:b/>
                 <w:bCs/>
-                <w:sz w:val="12"/>
-                <w:szCs w:val="12"/>
-              </w:rPr>
-            </w:pPr>
-            <w:r>
-              <w:rPr>
-                <w:b/>
-                <w:bCs/>
-                <w:sz w:val="12"/>
-                <w:szCs w:val="12"/>
+                <w:sz w:val="10"/>
+                <w:szCs w:val="10"/>
+              </w:rPr>
+            </w:pPr>
+            <w:r>
+              <w:rPr>
+                <w:b/>
+                <w:bCs/>
+                <w:sz w:val="10"/>
+                <w:szCs w:val="10"/>
+              </w:rPr>
+              <w:t>KETERANGAN</w:t>
+            </w:r>
+          </w:p>
+        </w:tc>
+        <w:tc>
+          <w:tcPr>
+            <w:tcW w:w="850" w:type="dxa"/>
+            <w:vAlign w:val="center"/>
+          </w:tcPr>
+          <w:p>
+            <w:pPr>
+              <w:widowControl w:val="0"/>
+              <w:jc w:val="center"/>
+              <w:rPr>
+                <w:b/>
+                <w:bCs/>
+                <w:sz w:val="10"/>
+                <w:szCs w:val="10"/>
+              </w:rPr>
+            </w:pPr>
+            <w:r>
+              <w:rPr>
+                <w:b/>
+                <w:bCs/>
+                <w:sz w:val="10"/>
+                <w:szCs w:val="10"/>
               </w:rPr>
               <w:t>PERANGKAT DAERAH ASAL</w:t>
             </w:r>
@@ -1941,7 +1953,7 @@
         </w:tc>
         <w:tc>
           <w:tcPr>
-            <w:tcW w:w="1134" w:type="dxa"/>
+            <w:tcW w:w="850" w:type="dxa"/>
             <w:vAlign w:val="center"/>
           </w:tcPr>
           <w:p>
@@ -1951,16 +1963,16 @@
               <w:rPr>
                 <w:b/>
                 <w:bCs/>
-                <w:sz w:val="12"/>
-                <w:szCs w:val="12"/>
-              </w:rPr>
-            </w:pPr>
-            <w:r>
-              <w:rPr>
-                <w:b/>
-                <w:bCs/>
-                <w:sz w:val="12"/>
-                <w:szCs w:val="12"/>
+                <w:sz w:val="10"/>
+                <w:szCs w:val="10"/>
+              </w:rPr>
+            </w:pPr>
+            <w:r>
+              <w:rPr>
+                <w:b/>
+                <w:bCs/>
+                <w:sz w:val="10"/>
+                <w:szCs w:val="10"/>
               </w:rPr>
               <w:t>PERANGKAT DAERAH TUJUAN</w:t>
             </w:r>
@@ -1973,7 +1985,7 @@
         </w:trPr>
         <w:tc>
           <w:tcPr>
-            <w:tcW w:w="283" w:type="dxa"/>
+            <w:tcW w:w="282" w:type="dxa"/>
             <w:tcMar>
               <w:top w:w="40" w:type="dxa"/>
               <w:left w:w="40" w:type="dxa"/>
@@ -1986,60 +1998,42 @@
               <w:keepLines/>
               <w:widowControl w:val="0"/>
               <w:rPr>
-                <w:sz w:val="12"/>
-                <w:szCs w:val="12"/>
+                <w:sz w:val="10"/>
+                <w:szCs w:val="10"/>
               </w:rPr>
             </w:pPr>
             <w:r>
               <w:rPr>
                 <w:rStyle w:val="HTMLCode"/>
                 <w:rFonts w:ascii="Arial" w:eastAsia="Arial" w:hAnsi="Arial" w:cs="Arial"/>
-                <w:sz w:val="12"/>
-                <w:szCs w:val="12"/>
-              </w:rPr>
-              <w:t>{#</w:t>
-            </w:r>
-            <w:r>
+                <w:sz w:val="10"/>
+                <w:szCs w:val="10"/>
+              </w:rPr>
+              <w:t>{#data}{no}</w:t>
+            </w:r>
+          </w:p>
+        </w:tc>
+        <w:tc>
+          <w:tcPr>
+            <w:tcW w:w="680" w:type="dxa"/>
+          </w:tcPr>
+          <w:p>
+            <w:pPr>
+              <w:keepLines/>
+              <w:widowControl w:val="0"/>
               <w:rPr>
                 <w:rStyle w:val="HTMLCode"/>
                 <w:rFonts w:ascii="Arial" w:eastAsia="Arial" w:hAnsi="Arial" w:cs="Arial"/>
-                <w:sz w:val="12"/>
-                <w:szCs w:val="12"/>
-              </w:rPr>
-              <w:t>data</w:t>
-            </w:r>
+                <w:sz w:val="10"/>
+                <w:szCs w:val="10"/>
+              </w:rPr>
+            </w:pPr>
             <w:r>
               <w:rPr>
                 <w:rStyle w:val="HTMLCode"/>
                 <w:rFonts w:ascii="Arial" w:eastAsia="Arial" w:hAnsi="Arial" w:cs="Arial"/>
-                <w:sz w:val="12"/>
-                <w:szCs w:val="12"/>
-              </w:rPr>
-              <w:t>}{no}</w:t>
-            </w:r>
-          </w:p>
-        </w:tc>
-        <w:tc>
-          <w:tcPr>
-            <w:tcW w:w="680" w:type="dxa"/>
-          </w:tcPr>
-          <w:p>
-            <w:pPr>
-              <w:keepLines/>
-              <w:widowControl w:val="0"/>
-              <w:rPr>
-                <w:rStyle w:val="HTMLCode"/>
-                <w:rFonts w:ascii="Arial" w:eastAsia="Arial" w:hAnsi="Arial" w:cs="Arial"/>
-                <w:sz w:val="12"/>
-                <w:szCs w:val="12"/>
-              </w:rPr>
-            </w:pPr>
-            <w:r>
-              <w:rPr>
-                <w:rStyle w:val="HTMLCode"/>
-                <w:rFonts w:ascii="Arial" w:eastAsia="Arial" w:hAnsi="Arial" w:cs="Arial"/>
-                <w:sz w:val="12"/>
-                <w:szCs w:val="12"/>
+                <w:sz w:val="10"/>
+                <w:szCs w:val="10"/>
               </w:rPr>
               <w:t>{assetType}</w:t>
             </w:r>
@@ -2060,16 +2054,16 @@
               <w:keepLines/>
               <w:widowControl w:val="0"/>
               <w:rPr>
-                <w:sz w:val="12"/>
-                <w:szCs w:val="12"/>
+                <w:sz w:val="10"/>
+                <w:szCs w:val="10"/>
               </w:rPr>
             </w:pPr>
             <w:r>
               <w:rPr>
                 <w:rStyle w:val="HTMLCode"/>
                 <w:rFonts w:ascii="Arial" w:eastAsia="Arial" w:hAnsi="Arial" w:cs="Arial"/>
-                <w:sz w:val="12"/>
-                <w:szCs w:val="12"/>
+                <w:sz w:val="10"/>
+                <w:szCs w:val="10"/>
               </w:rPr>
               <w:t>{kodeBarang}</w:t>
             </w:r>
@@ -2077,7 +2071,7 @@
         </w:tc>
         <w:tc>
           <w:tcPr>
-            <w:tcW w:w="1134" w:type="dxa"/>
+            <w:tcW w:w="850" w:type="dxa"/>
             <w:tcMar>
               <w:top w:w="40" w:type="dxa"/>
               <w:left w:w="40" w:type="dxa"/>
@@ -2090,16 +2084,16 @@
               <w:keepLines/>
               <w:widowControl w:val="0"/>
               <w:rPr>
-                <w:sz w:val="12"/>
-                <w:szCs w:val="12"/>
+                <w:sz w:val="10"/>
+                <w:szCs w:val="10"/>
               </w:rPr>
             </w:pPr>
             <w:r>
               <w:rPr>
                 <w:rStyle w:val="HTMLCode"/>
                 <w:rFonts w:ascii="Arial" w:eastAsia="Arial" w:hAnsi="Arial" w:cs="Arial"/>
-                <w:sz w:val="12"/>
-                <w:szCs w:val="12"/>
+                <w:sz w:val="10"/>
+                <w:szCs w:val="10"/>
               </w:rPr>
               <w:t>{nibar}</w:t>
             </w:r>
@@ -2107,7 +2101,7 @@
         </w:tc>
         <w:tc>
           <w:tcPr>
-            <w:tcW w:w="1134" w:type="dxa"/>
+            <w:tcW w:w="850" w:type="dxa"/>
             <w:tcMar>
               <w:top w:w="40" w:type="dxa"/>
               <w:left w:w="40" w:type="dxa"/>
@@ -2120,16 +2114,16 @@
               <w:keepLines/>
               <w:widowControl w:val="0"/>
               <w:rPr>
-                <w:sz w:val="12"/>
-                <w:szCs w:val="12"/>
+                <w:sz w:val="10"/>
+                <w:szCs w:val="10"/>
               </w:rPr>
             </w:pPr>
             <w:r>
               <w:rPr>
                 <w:rStyle w:val="HTMLCode"/>
                 <w:rFonts w:ascii="Arial" w:eastAsia="Arial" w:hAnsi="Arial" w:cs="Arial"/>
-                <w:sz w:val="12"/>
-                <w:szCs w:val="12"/>
+                <w:sz w:val="10"/>
+                <w:szCs w:val="10"/>
               </w:rPr>
               <w:t>{kodeRegister}</w:t>
             </w:r>
@@ -2150,16 +2144,16 @@
               <w:keepLines/>
               <w:widowControl w:val="0"/>
               <w:rPr>
-                <w:sz w:val="12"/>
-                <w:szCs w:val="12"/>
+                <w:sz w:val="10"/>
+                <w:szCs w:val="10"/>
               </w:rPr>
             </w:pPr>
             <w:r>
               <w:rPr>
                 <w:rStyle w:val="HTMLCode"/>
                 <w:rFonts w:ascii="Arial" w:eastAsia="Arial" w:hAnsi="Arial" w:cs="Arial"/>
-                <w:sz w:val="12"/>
-                <w:szCs w:val="12"/>
+                <w:sz w:val="10"/>
+                <w:szCs w:val="10"/>
               </w:rPr>
               <w:t>{namaBarangKategori}</w:t>
             </w:r>
@@ -2180,16 +2174,16 @@
               <w:keepLines/>
               <w:widowControl w:val="0"/>
               <w:rPr>
-                <w:sz w:val="12"/>
-                <w:szCs w:val="12"/>
+                <w:sz w:val="10"/>
+                <w:szCs w:val="10"/>
               </w:rPr>
             </w:pPr>
             <w:r>
               <w:rPr>
                 <w:rStyle w:val="HTMLCode"/>
                 <w:rFonts w:ascii="Arial" w:eastAsia="Arial" w:hAnsi="Arial" w:cs="Arial"/>
-                <w:sz w:val="12"/>
-                <w:szCs w:val="12"/>
+                <w:sz w:val="10"/>
+                <w:szCs w:val="10"/>
               </w:rPr>
               <w:t>{merkTipe}</w:t>
             </w:r>
@@ -2210,16 +2204,16 @@
               <w:keepLines/>
               <w:widowControl w:val="0"/>
               <w:rPr>
-                <w:sz w:val="12"/>
-                <w:szCs w:val="12"/>
+                <w:sz w:val="10"/>
+                <w:szCs w:val="10"/>
               </w:rPr>
             </w:pPr>
             <w:r>
               <w:rPr>
                 <w:rStyle w:val="HTMLCode"/>
                 <w:rFonts w:ascii="Arial" w:eastAsia="Arial" w:hAnsi="Arial" w:cs="Arial"/>
-                <w:sz w:val="12"/>
-                <w:szCs w:val="12"/>
+                <w:sz w:val="10"/>
+                <w:szCs w:val="10"/>
               </w:rPr>
               <w:t>{nomorPolisi}</w:t>
             </w:r>
@@ -2240,16 +2234,16 @@
               <w:keepLines/>
               <w:widowControl w:val="0"/>
               <w:rPr>
-                <w:sz w:val="12"/>
-                <w:szCs w:val="12"/>
+                <w:sz w:val="10"/>
+                <w:szCs w:val="10"/>
               </w:rPr>
             </w:pPr>
             <w:r>
               <w:rPr>
                 <w:rStyle w:val="HTMLCode"/>
                 <w:rFonts w:ascii="Arial" w:eastAsia="Arial" w:hAnsi="Arial" w:cs="Arial"/>
-                <w:sz w:val="12"/>
-                <w:szCs w:val="12"/>
+                <w:sz w:val="10"/>
+                <w:szCs w:val="10"/>
               </w:rPr>
               <w:t>{nomorRangka}</w:t>
             </w:r>
@@ -2270,16 +2264,16 @@
               <w:keepLines/>
               <w:widowControl w:val="0"/>
               <w:rPr>
-                <w:sz w:val="12"/>
-                <w:szCs w:val="12"/>
+                <w:sz w:val="10"/>
+                <w:szCs w:val="10"/>
               </w:rPr>
             </w:pPr>
             <w:r>
               <w:rPr>
                 <w:rStyle w:val="HTMLCode"/>
                 <w:rFonts w:ascii="Arial" w:eastAsia="Arial" w:hAnsi="Arial" w:cs="Arial"/>
-                <w:sz w:val="12"/>
-                <w:szCs w:val="12"/>
+                <w:sz w:val="10"/>
+                <w:szCs w:val="10"/>
               </w:rPr>
               <w:t>{nomorMesin}</w:t>
             </w:r>
@@ -2300,16 +2294,16 @@
               <w:keepLines/>
               <w:widowControl w:val="0"/>
               <w:rPr>
-                <w:sz w:val="12"/>
-                <w:szCs w:val="12"/>
+                <w:sz w:val="10"/>
+                <w:szCs w:val="10"/>
               </w:rPr>
             </w:pPr>
             <w:r>
               <w:rPr>
                 <w:rStyle w:val="HTMLCode"/>
                 <w:rFonts w:ascii="Arial" w:eastAsia="Arial" w:hAnsi="Arial" w:cs="Arial"/>
-                <w:sz w:val="12"/>
-                <w:szCs w:val="12"/>
+                <w:sz w:val="10"/>
+                <w:szCs w:val="10"/>
               </w:rPr>
               <w:t>{kondisi}</w:t>
             </w:r>
@@ -2330,16 +2324,16 @@
               <w:keepLines/>
               <w:widowControl w:val="0"/>
               <w:rPr>
-                <w:sz w:val="12"/>
-                <w:szCs w:val="12"/>
+                <w:sz w:val="10"/>
+                <w:szCs w:val="10"/>
               </w:rPr>
             </w:pPr>
             <w:r>
               <w:rPr>
                 <w:rStyle w:val="HTMLCode"/>
                 <w:rFonts w:ascii="Arial" w:eastAsia="Arial" w:hAnsi="Arial" w:cs="Arial"/>
-                <w:sz w:val="12"/>
-                <w:szCs w:val="12"/>
+                <w:sz w:val="10"/>
+                <w:szCs w:val="10"/>
               </w:rPr>
               <w:t>{lokasi}</w:t>
             </w:r>
@@ -2360,16 +2354,16 @@
               <w:keepLines/>
               <w:widowControl w:val="0"/>
               <w:rPr>
-                <w:sz w:val="12"/>
-                <w:szCs w:val="12"/>
+                <w:sz w:val="10"/>
+                <w:szCs w:val="10"/>
               </w:rPr>
             </w:pPr>
             <w:r>
               <w:rPr>
                 <w:rStyle w:val="HTMLCode"/>
                 <w:rFonts w:ascii="Arial" w:eastAsia="Arial" w:hAnsi="Arial" w:cs="Arial"/>
-                <w:sz w:val="12"/>
-                <w:szCs w:val="12"/>
+                <w:sz w:val="10"/>
+                <w:szCs w:val="10"/>
               </w:rPr>
               <w:t>{asalUsul}</w:t>
             </w:r>
@@ -2384,16 +2378,16 @@
               <w:keepLines/>
               <w:widowControl w:val="0"/>
               <w:rPr>
-                <w:sz w:val="12"/>
-                <w:szCs w:val="12"/>
+                <w:sz w:val="10"/>
+                <w:szCs w:val="10"/>
               </w:rPr>
             </w:pPr>
             <w:r>
               <w:rPr>
                 <w:rStyle w:val="HTMLCode"/>
                 <w:rFonts w:ascii="Arial" w:eastAsia="Arial" w:hAnsi="Arial" w:cs="Arial"/>
-                <w:sz w:val="12"/>
-                <w:szCs w:val="12"/>
+                <w:sz w:val="10"/>
+                <w:szCs w:val="10"/>
               </w:rPr>
               <w:t>{tahun}</w:t>
             </w:r>
@@ -2401,7 +2395,7 @@
         </w:tc>
         <w:tc>
           <w:tcPr>
-            <w:tcW w:w="567" w:type="dxa"/>
+            <w:tcW w:w="568" w:type="dxa"/>
           </w:tcPr>
           <w:p>
             <w:pPr>
@@ -2411,16 +2405,16 @@
               <w:rPr>
                 <w:rStyle w:val="HTMLCode"/>
                 <w:rFonts w:ascii="Arial" w:eastAsia="Arial" w:hAnsi="Arial" w:cs="Arial"/>
-                <w:sz w:val="12"/>
-                <w:szCs w:val="12"/>
+                <w:sz w:val="10"/>
+                <w:szCs w:val="10"/>
               </w:rPr>
             </w:pPr>
             <w:r>
               <w:rPr>
                 <w:rStyle w:val="HTMLCode"/>
                 <w:rFonts w:ascii="Arial" w:eastAsia="Arial" w:hAnsi="Arial" w:cs="Arial"/>
-                <w:sz w:val="12"/>
-                <w:szCs w:val="12"/>
+                <w:sz w:val="10"/>
+                <w:szCs w:val="10"/>
               </w:rPr>
               <w:t>{jumlah}</w:t>
             </w:r>
@@ -2438,16 +2432,16 @@
               <w:rPr>
                 <w:rStyle w:val="HTMLCode"/>
                 <w:rFonts w:ascii="Arial" w:eastAsia="Arial" w:hAnsi="Arial" w:cs="Arial"/>
-                <w:sz w:val="12"/>
-                <w:szCs w:val="12"/>
+                <w:sz w:val="10"/>
+                <w:szCs w:val="10"/>
               </w:rPr>
             </w:pPr>
             <w:r>
               <w:rPr>
                 <w:rStyle w:val="HTMLCode"/>
                 <w:rFonts w:ascii="Arial" w:eastAsia="Arial" w:hAnsi="Arial" w:cs="Arial"/>
-                <w:sz w:val="12"/>
-                <w:szCs w:val="12"/>
+                <w:sz w:val="10"/>
+                <w:szCs w:val="10"/>
               </w:rPr>
               <w:t>{nilaiPerolehan}</w:t>
             </w:r>
@@ -2465,16 +2459,16 @@
               <w:rPr>
                 <w:rStyle w:val="HTMLCode"/>
                 <w:rFonts w:ascii="Arial" w:eastAsia="Arial" w:hAnsi="Arial" w:cs="Arial"/>
-                <w:sz w:val="12"/>
-                <w:szCs w:val="12"/>
+                <w:sz w:val="10"/>
+                <w:szCs w:val="10"/>
               </w:rPr>
             </w:pPr>
             <w:r>
               <w:rPr>
                 <w:rStyle w:val="HTMLCode"/>
                 <w:rFonts w:ascii="Arial" w:eastAsia="Arial" w:hAnsi="Arial" w:cs="Arial"/>
-                <w:sz w:val="12"/>
-                <w:szCs w:val="12"/>
+                <w:sz w:val="10"/>
+                <w:szCs w:val="10"/>
               </w:rPr>
               <w:t>{akumulasiPenyusutan}</w:t>
             </w:r>
@@ -2492,16 +2486,16 @@
               <w:rPr>
                 <w:rStyle w:val="HTMLCode"/>
                 <w:rFonts w:ascii="Arial" w:eastAsia="Arial" w:hAnsi="Arial" w:cs="Arial"/>
-                <w:sz w:val="12"/>
-                <w:szCs w:val="12"/>
+                <w:sz w:val="10"/>
+                <w:szCs w:val="10"/>
               </w:rPr>
             </w:pPr>
             <w:r>
               <w:rPr>
                 <w:rStyle w:val="HTMLCode"/>
                 <w:rFonts w:ascii="Arial" w:eastAsia="Arial" w:hAnsi="Arial" w:cs="Arial"/>
-                <w:sz w:val="12"/>
-                <w:szCs w:val="12"/>
+                <w:sz w:val="10"/>
+                <w:szCs w:val="10"/>
               </w:rPr>
               <w:t>{nilaiBuku}</w:t>
             </w:r>
@@ -2518,23 +2512,49 @@
               <w:rPr>
                 <w:rStyle w:val="HTMLCode"/>
                 <w:rFonts w:ascii="Arial" w:eastAsia="Arial" w:hAnsi="Arial" w:cs="Arial"/>
-                <w:sz w:val="12"/>
-                <w:szCs w:val="12"/>
+                <w:sz w:val="10"/>
+                <w:szCs w:val="10"/>
               </w:rPr>
             </w:pPr>
             <w:r>
               <w:rPr>
                 <w:rStyle w:val="HTMLCode"/>
                 <w:rFonts w:ascii="Arial" w:eastAsia="Arial" w:hAnsi="Arial" w:cs="Arial"/>
-                <w:sz w:val="12"/>
-                <w:szCs w:val="12"/>
+                <w:sz w:val="10"/>
+                <w:szCs w:val="10"/>
+              </w:rPr>
+              <w:t>{keterangan}</w:t>
+            </w:r>
+          </w:p>
+        </w:tc>
+        <w:tc>
+          <w:tcPr>
+            <w:tcW w:w="850" w:type="dxa"/>
+          </w:tcPr>
+          <w:p>
+            <w:pPr>
+              <w:keepLines/>
+              <w:widowControl w:val="0"/>
+              <w:rPr>
+                <w:rStyle w:val="HTMLCode"/>
+                <w:rFonts w:ascii="Arial" w:eastAsia="Arial" w:hAnsi="Arial" w:cs="Arial"/>
+                <w:sz w:val="10"/>
+                <w:szCs w:val="10"/>
+              </w:rPr>
+            </w:pPr>
+            <w:r>
+              <w:rPr>
+                <w:rStyle w:val="HTMLCode"/>
+                <w:rFonts w:ascii="Arial" w:eastAsia="Arial" w:hAnsi="Arial" w:cs="Arial"/>
+                <w:sz w:val="10"/>
+                <w:szCs w:val="10"/>
               </w:rPr>
               <w:t>{</w:t>
             </w:r>
             <w:r>
               <w:rPr>
-                <w:sz w:val="12"/>
-                <w:szCs w:val="12"/>
+                <w:sz w:val="10"/>
+                <w:szCs w:val="10"/>
               </w:rPr>
               <w:t>perangkatDaerahAsal</w:t>
             </w:r>
@@ -2542,8 +2562,8 @@
               <w:rPr>
                 <w:rStyle w:val="HTMLCode"/>
                 <w:rFonts w:ascii="Arial" w:eastAsia="Arial" w:hAnsi="Arial" w:cs="Arial"/>
-                <w:sz w:val="12"/>
-                <w:szCs w:val="12"/>
+                <w:sz w:val="10"/>
+                <w:szCs w:val="10"/>
               </w:rPr>
               <w:t>}</w:t>
             </w:r>
@@ -2551,7 +2571,7 @@
         </w:tc>
         <w:tc>
           <w:tcPr>
-            <w:tcW w:w="1134" w:type="dxa"/>
+            <w:tcW w:w="850" w:type="dxa"/>
           </w:tcPr>
           <w:p>
             <w:pPr>
@@ -2560,23 +2580,23 @@
               <w:rPr>
                 <w:rStyle w:val="HTMLCode"/>
                 <w:rFonts w:ascii="Arial" w:eastAsia="Arial" w:hAnsi="Arial" w:cs="Arial"/>
-                <w:sz w:val="12"/>
-                <w:szCs w:val="12"/>
+                <w:sz w:val="10"/>
+                <w:szCs w:val="10"/>
               </w:rPr>
             </w:pPr>
             <w:r>
               <w:rPr>
                 <w:rStyle w:val="HTMLCode"/>
                 <w:rFonts w:ascii="Arial" w:eastAsia="Arial" w:hAnsi="Arial" w:cs="Arial"/>
-                <w:sz w:val="12"/>
-                <w:szCs w:val="12"/>
+                <w:sz w:val="10"/>
+                <w:szCs w:val="10"/>
               </w:rPr>
               <w:t>{</w:t>
             </w:r>
             <w:r>
               <w:rPr>
-                <w:sz w:val="12"/>
-                <w:szCs w:val="12"/>
+                <w:sz w:val="10"/>
+                <w:szCs w:val="10"/>
               </w:rPr>
               <w:t>perangkatDaerahTujuan</w:t>
             </w:r>
@@ -2584,28 +2604,10 @@
               <w:rPr>
                 <w:rStyle w:val="HTMLCode"/>
                 <w:rFonts w:ascii="Arial" w:eastAsia="Arial" w:hAnsi="Arial" w:cs="Arial"/>
-                <w:sz w:val="12"/>
-                <w:szCs w:val="12"/>
-              </w:rPr>
-              <w:t>}{/</w:t>
-            </w:r>
-            <w:r>
-              <w:rPr>
-                <w:rStyle w:val="HTMLCode"/>
-                <w:rFonts w:ascii="Arial" w:eastAsia="Arial" w:hAnsi="Arial" w:cs="Arial"/>
-                <w:sz w:val="12"/>
-                <w:szCs w:val="12"/>
-              </w:rPr>
-              <w:t>data</w:t>
-            </w:r>
-            <w:r>
-              <w:rPr>
-                <w:rStyle w:val="HTMLCode"/>
-                <w:rFonts w:ascii="Arial" w:eastAsia="Arial" w:hAnsi="Arial" w:cs="Arial"/>
-                <w:sz w:val="12"/>
-                <w:szCs w:val="12"/>
-              </w:rPr>
-              <w:t>}</w:t>
+                <w:sz w:val="10"/>
+                <w:szCs w:val="10"/>
+              </w:rPr>
+              <w:t>}{/data}</w:t>
             </w:r>
           </w:p>
         </w:tc>
@@ -2616,7 +2618,7 @@
         </w:trPr>
         <w:tc>
           <w:tcPr>
-            <w:tcW w:w="10203" w:type="dxa"/>
+            <w:tcW w:w="9635" w:type="dxa"/>
             <w:gridSpan w:val="14"/>
             <w:tcMar>
               <w:top w:w="40" w:type="dxa"/>
@@ -2634,20 +2636,16 @@
               <w:rPr>
                 <w:rStyle w:val="HTMLCode"/>
                 <w:rFonts w:ascii="Arial" w:eastAsia="Arial" w:hAnsi="Arial" w:cs="Arial"/>
-                <w:b/>
-                <w:bCs/>
-                <w:sz w:val="12"/>
-                <w:szCs w:val="12"/>
+                <w:sz w:val="10"/>
+                <w:szCs w:val="10"/>
               </w:rPr>
             </w:pPr>
             <w:r>
               <w:rPr>
                 <w:rStyle w:val="HTMLCode"/>
                 <w:rFonts w:ascii="Arial" w:eastAsia="Arial" w:hAnsi="Arial" w:cs="Arial"/>
-                <w:b/>
-                <w:bCs/>
-                <w:sz w:val="12"/>
-                <w:szCs w:val="12"/>
+                <w:sz w:val="10"/>
+                <w:szCs w:val="10"/>
               </w:rPr>
               <w:t>JUMLAH</w:t>
             </w:r>
@@ -2666,16 +2664,16 @@
               <w:rPr>
                 <w:rStyle w:val="HTMLCode"/>
                 <w:rFonts w:ascii="Arial" w:eastAsia="Arial" w:hAnsi="Arial" w:cs="Arial"/>
-                <w:sz w:val="12"/>
-                <w:szCs w:val="12"/>
-              </w:rPr>
-            </w:pPr>
-            <w:r>
-              <w:rPr>
-                <w:b/>
-                <w:bCs/>
-                <w:sz w:val="12"/>
-                <w:szCs w:val="12"/>
+                <w:sz w:val="10"/>
+                <w:szCs w:val="10"/>
+              </w:rPr>
+            </w:pPr>
+            <w:r>
+              <w:rPr>
+                <w:b/>
+                <w:bCs/>
+                <w:sz w:val="10"/>
+                <w:szCs w:val="10"/>
               </w:rPr>
               <w:t>{total-data}</w:t>
             </w:r>
@@ -2694,16 +2692,16 @@
               <w:rPr>
                 <w:rStyle w:val="HTMLCode"/>
                 <w:rFonts w:ascii="Arial" w:eastAsia="Arial" w:hAnsi="Arial" w:cs="Arial"/>
-                <w:sz w:val="12"/>
-                <w:szCs w:val="12"/>
-              </w:rPr>
-            </w:pPr>
-            <w:r>
-              <w:rPr>
-                <w:b/>
-                <w:bCs/>
-                <w:sz w:val="12"/>
-                <w:szCs w:val="12"/>
+                <w:sz w:val="10"/>
+                <w:szCs w:val="10"/>
+              </w:rPr>
+            </w:pPr>
+            <w:r>
+              <w:rPr>
+                <w:b/>
+                <w:bCs/>
+                <w:sz w:val="10"/>
+                <w:szCs w:val="10"/>
               </w:rPr>
               <w:t>{total-perolehan}</w:t>
             </w:r>
@@ -2722,16 +2720,16 @@
               <w:rPr>
                 <w:rStyle w:val="HTMLCode"/>
                 <w:rFonts w:ascii="Arial" w:eastAsia="Arial" w:hAnsi="Arial" w:cs="Arial"/>
-                <w:sz w:val="12"/>
-                <w:szCs w:val="12"/>
-              </w:rPr>
-            </w:pPr>
-            <w:r>
-              <w:rPr>
-                <w:b/>
-                <w:bCs/>
-                <w:sz w:val="12"/>
-                <w:szCs w:val="12"/>
+                <w:sz w:val="10"/>
+                <w:szCs w:val="10"/>
+              </w:rPr>
+            </w:pPr>
+            <w:r>
+              <w:rPr>
+                <w:b/>
+                <w:bCs/>
+                <w:sz w:val="10"/>
+                <w:szCs w:val="10"/>
               </w:rPr>
               <w:t>{total-penyusutan}</w:t>
             </w:r>
@@ -2750,16 +2748,16 @@
               <w:rPr>
                 <w:rStyle w:val="HTMLCode"/>
                 <w:rFonts w:ascii="Arial" w:eastAsia="Arial" w:hAnsi="Arial" w:cs="Arial"/>
-                <w:sz w:val="12"/>
-                <w:szCs w:val="12"/>
-              </w:rPr>
-            </w:pPr>
-            <w:r>
-              <w:rPr>
-                <w:b/>
-                <w:bCs/>
-                <w:sz w:val="12"/>
-                <w:szCs w:val="12"/>
+                <w:sz w:val="10"/>
+                <w:szCs w:val="10"/>
+              </w:rPr>
+            </w:pPr>
+            <w:r>
+              <w:rPr>
+                <w:b/>
+                <w:bCs/>
+                <w:sz w:val="10"/>
+                <w:szCs w:val="10"/>
               </w:rPr>
               <w:t>{total-buku}</w:t>
             </w:r>
@@ -2768,35 +2766,51 @@
         <w:tc>
           <w:tcPr>
             <w:tcW w:w="1134" w:type="dxa"/>
+            <w:vAlign w:val="center"/>
           </w:tcPr>
           <w:p>
             <w:pPr>
               <w:keepLines/>
               <w:widowControl w:val="0"/>
-              <w:jc w:val="center"/>
               <w:rPr>
                 <w:rStyle w:val="HTMLCode"/>
                 <w:rFonts w:ascii="Arial" w:eastAsia="Arial" w:hAnsi="Arial" w:cs="Arial"/>
-                <w:sz w:val="12"/>
-                <w:szCs w:val="12"/>
-              </w:rPr>
-            </w:pPr>
-          </w:p>
-        </w:tc>
-        <w:tc>
-          <w:tcPr>
-            <w:tcW w:w="1134" w:type="dxa"/>
+                <w:sz w:val="10"/>
+                <w:szCs w:val="10"/>
+              </w:rPr>
+            </w:pPr>
+          </w:p>
+        </w:tc>
+        <w:tc>
+          <w:tcPr>
+            <w:tcW w:w="850" w:type="dxa"/>
           </w:tcPr>
           <w:p>
             <w:pPr>
               <w:keepLines/>
               <w:widowControl w:val="0"/>
-              <w:jc w:val="center"/>
               <w:rPr>
                 <w:rStyle w:val="HTMLCode"/>
                 <w:rFonts w:ascii="Arial" w:eastAsia="Arial" w:hAnsi="Arial" w:cs="Arial"/>
-                <w:sz w:val="12"/>
-                <w:szCs w:val="12"/>
+                <w:sz w:val="10"/>
+                <w:szCs w:val="10"/>
+              </w:rPr>
+            </w:pPr>
+          </w:p>
+        </w:tc>
+        <w:tc>
+          <w:tcPr>
+            <w:tcW w:w="850" w:type="dxa"/>
+          </w:tcPr>
+          <w:p>
+            <w:pPr>
+              <w:keepLines/>
+              <w:widowControl w:val="0"/>
+              <w:rPr>
+                <w:rStyle w:val="HTMLCode"/>
+                <w:rFonts w:ascii="Arial" w:eastAsia="Arial" w:hAnsi="Arial" w:cs="Arial"/>
+                <w:sz w:val="10"/>
+                <w:szCs w:val="10"/>
               </w:rPr>
             </w:pPr>
           </w:p>

</xml_diff>